<commit_message>
Refina a Figura 3 (BPMN no padrão Bizagi)
- Fases do dia no topo (marcos), com os horários de cada janela
- Tipos de tarefa (usuário e envio), prazos em destaque e fluxo padrão
  na decisão do ComPel
- Planilha de controle como repositório de dados
- Raia do Polícia junto à do aspirante para encurtar os fluxos
- Textos que descrevem a figura atualizados; .bpmn com os mesmos elementos

Co-Authored-By: Claude Opus 5.5 <noreply@anthropic.com>
Claude-Session: https://claude.ai/code/session_01XBwkMD7yVbhYqVYqmmQ88y
</commit_message>
<xml_diff>
--- a/docs/licenca-especial/Redesenho_Licenca_Especial_ABNT.docx
+++ b/docs/licenca-especial/Redesenho_Licenca_Especial_ABNT.docx
@@ -6748,7 +6748,7 @@
         <w:t xml:space="preserve">Business Process Model and Notation</w:t>
       </w:r>
       <w:r>
-        <w:t xml:space="preserve">), padrão adotado por ferramentas de modelagem como o Bizagi Modeler. Cada participante ocupa uma raia horizontal, e as atividades se encadeiam da esquerda para a direita. Na sequência, o Quadro 4 apresenta a matriz de responsabilidades (RACI) correspondente.</w:t>
+        <w:t xml:space="preserve">), padrão adotado por ferramentas de modelagem como o Bizagi Modeler. Cada participante ocupa uma raia horizontal, e as atividades se encadeiam da esquerda para a direita, agrupadas nas cinco fases do dia indicadas no topo do diagrama. Na sequência, o Quadro 4 apresenta a matriz de responsabilidades (RACI) correspondente.</w:t>
       </w:r>
     </w:p>
     <w:p>
@@ -6783,7 +6783,7 @@
         </w:rPr>
         <w:drawing>
           <wp:inline distT="0" distB="0" distL="0" distR="0" wp14:anchorId="31EE0BEC" wp14:editId="144C22F2">
-            <wp:extent cx="8640000" cy="4810840"/>
+            <wp:extent cx="8640000" cy="4996810"/>
             <wp:effectExtent l="0" t="0" r="0" b="0"/>
             <wp:docPr id="3" name="fig3_processo_proposto_bpmn.png" descr="Fluxo do processo proposto (TO-BE) em notação BPMN" title="Fluxo do processo proposto (TO-BE)"/>
             <wp:cNvGraphicFramePr>
@@ -6808,7 +6808,7 @@
                   <pic:spPr bwMode="auto">
                     <a:xfrm>
                       <a:off x="0" y="0"/>
-                      <a:ext cx="8640000" cy="4810840"/>
+                      <a:ext cx="8640000" cy="4996810"/>
                     </a:xfrm>
                     <a:prstGeom prst="rect">
                       <a:avLst/>
@@ -9252,7 +9252,7 @@
         <w:jc w:val="both"/>
       </w:pPr>
       <w:r>
-        <w:t xml:space="preserve">Na Figura 3, os retângulos representam as atividades; os losangos, as decisões; e os círculos, os eventos de início, de tempo e de fim. A decisão do ComPel evidencia a gestão por exceção: o veto só é registrado quando há impedimento; caso contrário, a relação segue diretamente para o ComCia (Asp). Os eventos de tempo marcam os dois horários fixos do processo, o encerramento dos pedidos às 12h30 e a liberação a partir das 17h00. Tudo o que ocorre entre eles acontece durante a rotina, sem exigir deslocamento do aspirante, que executa apenas duas atividades: registrar o pedido e consultar o resultado.</w:t>
+        <w:t xml:space="preserve">Na Figura 3, os retângulos representam as atividades, com o prazo de cada uma em destaque; os losangos, as decisões; os círculos, os eventos de início, de tempo e de fim; e o cilindro, a planilha de controle, alimentada na conferência dos pedidos e na baixa do saldo. O ícone no canto de cada atividade indica se ela é executada por uma pessoa ou se consiste no envio de informação. A decisão do ComPel evidencia a gestão por exceção: o veto só é registrado quando há impedimento; caso contrário, caminho marcado como padrão, a relação segue diretamente para o ComCia (Asp). Os eventos de tempo marcam os dois horários fixos do processo, o encerramento dos pedidos às 12h30 e a liberação a partir das 17h00. Tudo o que ocorre entre eles acontece durante a rotina, sem exigir deslocamento do aspirante, que executa apenas duas atividades: registrar o pedido e consultar o resultado.</w:t>
       </w:r>
     </w:p>
     <w:p>

</xml_diff>